<commit_message>
Update Kursinis darbas I etapas.docx
</commit_message>
<xml_diff>
--- a/Kursinis darbas I etapas.docx
+++ b/Kursinis darbas I etapas.docx
@@ -13,34 +13,6 @@
     <w:p>
       <w:r>
         <w:t>Kursinio darbo I dalis: projektavimo dokumentas</w:t>
-      </w:r>
-    </w:p>
-    <w:p>
-      <w:pPr>
-        <w:spacing w:after="200" w:line="260" w:lineRule="exact"/>
-        <w:ind w:left="200"/>
-      </w:pPr>
-      <w:r>
-        <w:rPr>
-          <w:i/>
-          <w:color w:val="61717B"/>
-          <w:sz w:val="19"/>
-        </w:rPr>
-        <w:t>Pildymo instrukcija: pakeiskite tekstą laužtiniuose skliaustuose savo atsakymais. Lentelėse pridėkite tiek eilučių, kiek reikia. Prieš pateikdami pašalinkite šią instrukciją ir kitus pildymo paaiškinimus. Rekomenduojama apimtis – 3–5 puslapiai arba panašios apimties Markdown dokumentas.</w:t>
-      </w:r>
-    </w:p>
-    <w:p>
-      <w:pPr>
-        <w:spacing w:after="200" w:line="260" w:lineRule="exact"/>
-        <w:ind w:left="200"/>
-      </w:pPr>
-      <w:r>
-        <w:rPr>
-          <w:i/>
-          <w:color w:val="61717B"/>
-          <w:sz w:val="19"/>
-        </w:rPr>
-        <w:t>Šiame dokumente nenurodykite vardo, pavardės, grupės ar studento numerio. Dokumentą įkelkite į projekto „GitHub“ repozitoriją. Repozitorijos nuorodą ir studento numerį pateikite užduoties apraše nurodytoje „Google“ formoje. Pagal formoje pateiktus duomenis repozitorija bus susieta su studentu.</w:t>
       </w:r>
     </w:p>
     <w:p>
@@ -729,11 +701,7 @@
         <w:t xml:space="preserve"> </w:t>
       </w:r>
       <w:r>
-        <w:t xml:space="preserve">Automatinis duomenų gavimas iš banko sąskaitų, bankinių mokėjimų atlikimas, investicijų valdymas, paskolų administravimas ir profesionalus finansinis konsultavimas. Sistema </w:t>
-      </w:r>
-      <w:r>
-        <w:lastRenderedPageBreak/>
-        <w:t>taip pat nebus skirta įmonių apskaitai ar oficialių finansinių ataskaitų rengimui. Pagrindinis projekto tikslas – asmeninių pajamų ir išlaidų registravimas, saugojimas bei analizė.</w:t>
+        <w:t>Automatinis duomenų gavimas iš banko sąskaitų, bankinių mokėjimų atlikimas, investicijų valdymas, paskolų administravimas ir profesionalus finansinis konsultavimas. Sistema taip pat nebus skirta įmonių apskaitai ar oficialių finansinių ataskaitų rengimui. Pagrindinis projekto tikslas – asmeninių pajamų ir išlaidų registravimas, saugojimas bei analizė.</w:t>
       </w:r>
     </w:p>
     <w:p>
@@ -757,7 +725,10 @@
         <w:t>Pavadinimas ir atsakomybė:</w:t>
       </w:r>
       <w:r>
-        <w:t xml:space="preserve"> [Kokį uždavinį sprendžia?]</w:t>
+        <w:t xml:space="preserve"> </w:t>
+      </w:r>
+      <w:r>
+        <w:t>Finansinės suvestinės ir išlaidų analizės modulis. Modulis atsakingas už naudotojo pajamų ir išlaidų apskaičiavimą, bendro finansinio likučio nustatymą bei išlaidų paskirstymą pagal kategorijas pasirinktu laikotarpiu.</w:t>
       </w:r>
     </w:p>
     <w:p>
@@ -1111,7 +1082,7 @@
               <w:rPr>
                 <w:sz w:val="18"/>
               </w:rPr>
-              <w:t>Įprastas atvejis</w:t>
+              <w:t>Įprastas atvejis – pajamų ir išlaidų apskaičiavimas</w:t>
             </w:r>
           </w:p>
         </w:tc>
@@ -1129,13 +1100,15 @@
           </w:tcPr>
           <w:p>
             <w:pPr>
-              <w:spacing w:after="0" w:line="240" w:lineRule="exact"/>
+              <w:spacing w:after="0" w:line="240" w:lineRule="auto"/>
+              <w:rPr>
+                <w:rFonts w:ascii="Times New Roman" w:hAnsi="Times New Roman"/>
+                <w:color w:val="auto"/>
+                <w:sz w:val="24"/>
+              </w:rPr>
             </w:pPr>
             <w:r>
-              <w:rPr>
-                <w:sz w:val="18"/>
-              </w:rPr>
-              <w:t>[...]</w:t>
+              <w:t>Pasirinktas 2026-10-01–2026-10-31 laikotarpis. Pajamos: 1500 € ir 300 €. Išlaidos: 500 €, 150 € ir 100 €</w:t>
             </w:r>
           </w:p>
         </w:tc>
@@ -1153,13 +1126,15 @@
           </w:tcPr>
           <w:p>
             <w:pPr>
-              <w:spacing w:after="0" w:line="240" w:lineRule="exact"/>
+              <w:spacing w:after="0" w:line="240" w:lineRule="auto"/>
+              <w:rPr>
+                <w:rFonts w:ascii="Times New Roman" w:hAnsi="Times New Roman"/>
+                <w:color w:val="auto"/>
+                <w:sz w:val="24"/>
+              </w:rPr>
             </w:pPr>
             <w:r>
-              <w:rPr>
-                <w:sz w:val="18"/>
-              </w:rPr>
-              <w:t>[...]</w:t>
+              <w:t>Naudotojas atidaro spalio mėnesio finansinę suvestinę</w:t>
             </w:r>
           </w:p>
         </w:tc>
@@ -1177,13 +1152,15 @@
           </w:tcPr>
           <w:p>
             <w:pPr>
-              <w:spacing w:after="0" w:line="240" w:lineRule="exact"/>
+              <w:spacing w:after="0" w:line="240" w:lineRule="auto"/>
+              <w:rPr>
+                <w:rFonts w:ascii="Times New Roman" w:hAnsi="Times New Roman"/>
+                <w:color w:val="auto"/>
+                <w:sz w:val="24"/>
+              </w:rPr>
             </w:pPr>
             <w:r>
-              <w:rPr>
-                <w:sz w:val="18"/>
-              </w:rPr>
-              <w:t>[...]</w:t>
+              <w:t>Bendros pajamos = 1800 €, bendros išlaidos = 750 €, likutis = 1050 €</w:t>
             </w:r>
           </w:p>
         </w:tc>
@@ -1214,6 +1191,18 @@
               </w:rPr>
               <w:t>Ribinis atvejis arba konfliktas</w:t>
             </w:r>
+            <w:r>
+              <w:rPr>
+                <w:sz w:val="18"/>
+              </w:rPr>
+              <w:t xml:space="preserve"> - </w:t>
+            </w:r>
+            <w:r>
+              <w:rPr>
+                <w:sz w:val="18"/>
+              </w:rPr>
+              <w:t>Išlaidos didesnės už pajamas</w:t>
+            </w:r>
           </w:p>
         </w:tc>
         <w:tc>
@@ -1230,13 +1219,15 @@
           </w:tcPr>
           <w:p>
             <w:pPr>
-              <w:spacing w:after="0" w:line="240" w:lineRule="exact"/>
+              <w:spacing w:after="0" w:line="240" w:lineRule="auto"/>
+              <w:rPr>
+                <w:rFonts w:ascii="Times New Roman" w:hAnsi="Times New Roman"/>
+                <w:color w:val="auto"/>
+                <w:sz w:val="24"/>
+              </w:rPr>
             </w:pPr>
             <w:r>
-              <w:rPr>
-                <w:sz w:val="18"/>
-              </w:rPr>
-              <w:t>[...]</w:t>
+              <w:t>Pajamos = 500 €, išlaidos = 800 €</w:t>
             </w:r>
           </w:p>
         </w:tc>
@@ -1254,13 +1245,15 @@
           </w:tcPr>
           <w:p>
             <w:pPr>
-              <w:spacing w:after="0" w:line="240" w:lineRule="exact"/>
+              <w:spacing w:after="0" w:line="240" w:lineRule="auto"/>
+              <w:rPr>
+                <w:rFonts w:ascii="Times New Roman" w:hAnsi="Times New Roman"/>
+                <w:color w:val="auto"/>
+                <w:sz w:val="24"/>
+              </w:rPr>
             </w:pPr>
             <w:r>
-              <w:rPr>
-                <w:sz w:val="18"/>
-              </w:rPr>
-              <w:t>[...]</w:t>
+              <w:t>Naudotojas atidaro finansinę suvestinę</w:t>
             </w:r>
           </w:p>
         </w:tc>
@@ -1278,13 +1271,15 @@
           </w:tcPr>
           <w:p>
             <w:pPr>
-              <w:spacing w:after="0" w:line="240" w:lineRule="exact"/>
+              <w:spacing w:after="0" w:line="240" w:lineRule="auto"/>
+              <w:rPr>
+                <w:rFonts w:ascii="Times New Roman" w:hAnsi="Times New Roman"/>
+                <w:color w:val="auto"/>
+                <w:sz w:val="24"/>
+              </w:rPr>
             </w:pPr>
             <w:r>
-              <w:rPr>
-                <w:sz w:val="18"/>
-              </w:rPr>
-              <w:t>[...]</w:t>
+              <w:t>Likutis = -300 €. Sistema turi parodyti neigiamą likutį, o ne pakeisti jį į nulį</w:t>
             </w:r>
           </w:p>
         </w:tc>
@@ -1315,6 +1310,18 @@
               </w:rPr>
               <w:t>Klaida arba neįmanomas rezultatas</w:t>
             </w:r>
+            <w:r>
+              <w:rPr>
+                <w:sz w:val="18"/>
+              </w:rPr>
+              <w:t xml:space="preserve"> - </w:t>
+            </w:r>
+            <w:r>
+              <w:rPr>
+                <w:sz w:val="18"/>
+              </w:rPr>
+              <w:t>Neigiama operacijos suma</w:t>
+            </w:r>
           </w:p>
         </w:tc>
         <w:tc>
@@ -1331,13 +1338,15 @@
           </w:tcPr>
           <w:p>
             <w:pPr>
-              <w:spacing w:after="0" w:line="240" w:lineRule="exact"/>
+              <w:spacing w:after="0" w:line="240" w:lineRule="auto"/>
+              <w:rPr>
+                <w:rFonts w:ascii="Times New Roman" w:hAnsi="Times New Roman"/>
+                <w:color w:val="auto"/>
+                <w:sz w:val="24"/>
+              </w:rPr>
             </w:pPr>
             <w:r>
-              <w:rPr>
-                <w:sz w:val="18"/>
-              </w:rPr>
-              <w:t>[...]</w:t>
+              <w:t>Bandoma pridėti operaciją, kurios suma yra -50 €.</w:t>
             </w:r>
           </w:p>
         </w:tc>
@@ -1355,13 +1364,15 @@
           </w:tcPr>
           <w:p>
             <w:pPr>
-              <w:spacing w:after="0" w:line="240" w:lineRule="exact"/>
+              <w:spacing w:after="0" w:line="240" w:lineRule="auto"/>
+              <w:rPr>
+                <w:rFonts w:ascii="Times New Roman" w:hAnsi="Times New Roman"/>
+                <w:color w:val="auto"/>
+                <w:sz w:val="24"/>
+              </w:rPr>
             </w:pPr>
             <w:r>
-              <w:rPr>
-                <w:sz w:val="18"/>
-              </w:rPr>
-              <w:t>[...]</w:t>
+              <w:t>Naudotojas bando išsaugoti operaciją.</w:t>
             </w:r>
           </w:p>
         </w:tc>
@@ -1379,13 +1390,15 @@
           </w:tcPr>
           <w:p>
             <w:pPr>
-              <w:spacing w:after="0" w:line="240" w:lineRule="exact"/>
+              <w:spacing w:after="0" w:line="240" w:lineRule="auto"/>
+              <w:rPr>
+                <w:rFonts w:ascii="Times New Roman" w:hAnsi="Times New Roman"/>
+                <w:color w:val="auto"/>
+                <w:sz w:val="24"/>
+              </w:rPr>
             </w:pPr>
             <w:r>
-              <w:rPr>
-                <w:sz w:val="18"/>
-              </w:rPr>
-              <w:t>[...]</w:t>
+              <w:t>Sistema neleidžia išsaugoti operacijos ir informuoja, kad suma turi būti teigiama.</w:t>
             </w:r>
           </w:p>
         </w:tc>
@@ -1404,7 +1417,10 @@
         <w:t>Jei modulis naudoja AI:</w:t>
       </w:r>
       <w:r>
-        <w:t xml:space="preserve"> [Kaip paruošite įvestį, tikrinsite atsakymą ir elgsitės gavę netinkamą rezultatą? Kokiais pavyzdžiais ir kriterijais vertinsite jo kokybę? Jei netaikoma, parašykite „Netaikoma“.]</w:t>
+        <w:t xml:space="preserve"> </w:t>
+      </w:r>
+      <w:r>
+        <w:t>Netaikoma.</w:t>
       </w:r>
     </w:p>
     <w:p>
@@ -1457,6 +1473,7 @@
         <w:rPr>
           <w:b/>
         </w:rPr>
+        <w:lastRenderedPageBreak/>
         <w:t>Tikrinimo scenarijus ir sąlygos:</w:t>
       </w:r>
       <w:r>
@@ -1497,11 +1514,7 @@
         <w:t xml:space="preserve"> </w:t>
       </w:r>
       <w:r>
-        <w:t xml:space="preserve">Finansinės operacijos bus saugomos struktūrizuotai duomenų bazėje. Duomenų užklausose bus naudojamas filtravimas pagal naudotoją ir laikotarpį, o dažnai </w:t>
-      </w:r>
-      <w:r>
-        <w:lastRenderedPageBreak/>
-        <w:t>naudojamiems laukams, tokiems kaip data ir kategorija, prireikus bus naudojami indeksai. Finansinės suvestinės skaičiavimai bus atliekami tik pagal reikalingą duomenų kiekį.</w:t>
+        <w:t>Finansinės operacijos bus saugomos struktūrizuotai duomenų bazėje. Duomenų užklausose bus naudojamas filtravimas pagal naudotoją ir laikotarpį, o dažnai naudojamiems laukams, tokiems kaip data ir kategorija, prireikus bus naudojami indeksai. Finansinės suvestinės skaičiavimai bus atliekami tik pagal reikalingą duomenų kiekį.</w:t>
       </w:r>
     </w:p>
     <w:p>
@@ -1532,15 +1545,13 @@
         <w:t>Sprendimo kaina arba ribojimas:</w:t>
       </w:r>
       <w:r>
-        <w:t xml:space="preserve"> [Kokių trūkumų ar papildomo darbo jis turi?]</w:t>
+        <w:t xml:space="preserve"> </w:t>
       </w:r>
-    </w:p>
-    <w:p>
-      <w:pPr>
-        <w:jc w:val="both"/>
-      </w:pPr>
       <w:r>
-        <w:t>[Jei pasirenkate antrą atributą, pakartokite šią struktūrą.]</w:t>
+        <w:t>Našumo gerinimui gali reikėti papildomai optimizuoti duomenų bazės užklausas</w:t>
+      </w:r>
+      <w:r>
+        <w:t>.</w:t>
       </w:r>
     </w:p>
     <w:p>
@@ -1558,14 +1569,61 @@
         <w:pStyle w:val="Heading2"/>
       </w:pPr>
       <w:r>
+        <w:drawing>
+          <wp:anchor distT="0" distB="0" distL="114300" distR="114300" simplePos="0" relativeHeight="251659264" behindDoc="0" locked="0" layoutInCell="1" allowOverlap="1" wp14:anchorId="2CCBC143" wp14:editId="7086DB3A">
+            <wp:simplePos x="0" y="0"/>
+            <wp:positionH relativeFrom="column">
+              <wp:posOffset>-12700</wp:posOffset>
+            </wp:positionH>
+            <wp:positionV relativeFrom="paragraph">
+              <wp:posOffset>330200</wp:posOffset>
+            </wp:positionV>
+            <wp:extent cx="6468110" cy="2287270"/>
+            <wp:effectExtent l="0" t="0" r="8890" b="0"/>
+            <wp:wrapSquare wrapText="bothSides"/>
+            <wp:docPr id="1039719100" name="Picture 1"/>
+            <wp:cNvGraphicFramePr>
+              <a:graphicFrameLocks xmlns:a="http://schemas.openxmlformats.org/drawingml/2006/main" noChangeAspect="1"/>
+            </wp:cNvGraphicFramePr>
+            <a:graphic xmlns:a="http://schemas.openxmlformats.org/drawingml/2006/main">
+              <a:graphicData uri="http://schemas.openxmlformats.org/drawingml/2006/picture">
+                <pic:pic xmlns:pic="http://schemas.openxmlformats.org/drawingml/2006/picture">
+                  <pic:nvPicPr>
+                    <pic:cNvPr id="1039719100" name=""/>
+                    <pic:cNvPicPr/>
+                  </pic:nvPicPr>
+                  <pic:blipFill>
+                    <a:blip r:embed="rId8"/>
+                    <a:stretch>
+                      <a:fillRect/>
+                    </a:stretch>
+                  </pic:blipFill>
+                  <pic:spPr>
+                    <a:xfrm>
+                      <a:off x="0" y="0"/>
+                      <a:ext cx="6468110" cy="2287270"/>
+                    </a:xfrm>
+                    <a:prstGeom prst="rect">
+                      <a:avLst/>
+                    </a:prstGeom>
+                  </pic:spPr>
+                </pic:pic>
+              </a:graphicData>
+            </a:graphic>
+            <wp14:sizeRelH relativeFrom="margin">
+              <wp14:pctWidth>0</wp14:pctWidth>
+            </wp14:sizeRelH>
+            <wp14:sizeRelV relativeFrom="margin">
+              <wp14:pctHeight>0</wp14:pctHeight>
+            </wp14:sizeRelV>
+          </wp:anchor>
+        </w:drawing>
+      </w:r>
+      <w:r>
         <w:t>Paprasta schema</w:t>
       </w:r>
     </w:p>
-    <w:p>
-      <w:r>
-        <w:t>[Įterpkite schemą, rodančią pagrindines sistemos dalis ir jų ryšius: kaip naudotojas pateiks duomenis, kur veiks pagrindinė logika ir kur saugosite duomenis, jei to reikės.]</w:t>
-      </w:r>
-    </w:p>
+    <w:p/>
     <w:tbl>
       <w:tblPr>
         <w:tblW w:w="0" w:type="auto"/>
@@ -1907,7 +1965,10 @@
         <w:t>Planuojamos technologijos ir pasirinkimo priežastys:</w:t>
       </w:r>
       <w:r>
-        <w:t xml:space="preserve"> [Programavimo kalba ir kitos svarbiausios technologijos.]</w:t>
+        <w:t xml:space="preserve"> </w:t>
+      </w:r>
+      <w:r>
+        <w:t>Naudotojo sąsajai planuojama naudoti HTML, CSS ir JavaScript, nes šios technologijos leidžia sukurti interaktyvią ir naršyklėje veikiančią sąsają.</w:t>
       </w:r>
     </w:p>
     <w:p>
@@ -2218,7 +2279,11 @@
         <w:t xml:space="preserve"> </w:t>
       </w:r>
       <w:r>
-        <w:t>AI planuoju naudoti kaip pagalbinę priemonę programuojant sistemą: aiškinantis programavimo klaidas, generuojant paprastų funkcijų ar kodo fragmentų pavyzdžius, ieškant galimų sprendimų bei kuriant testų idėjas. AI taip pat gali būti naudojamas kodo struktūros tobulinimo pasiūlymams gauti.</w:t>
+        <w:t xml:space="preserve">AI planuoju naudoti kaip pagalbinę priemonę programuojant sistemą: aiškinantis programavimo klaidas, generuojant paprastų funkcijų ar kodo fragmentų pavyzdžius, ieškant galimų </w:t>
+      </w:r>
+      <w:r>
+        <w:lastRenderedPageBreak/>
+        <w:t>sprendimų bei kuriant testų idėjas. AI taip pat gali būti naudojamas kodo struktūros tobulinimo pasiūlymams gauti.</w:t>
       </w:r>
     </w:p>
     <w:p>
@@ -2384,7 +2449,7 @@
               <w:rPr>
                 <w:sz w:val="18"/>
               </w:rPr>
-              <w:t>[...]</w:t>
+              <w:t>Duomenų bazės projektavimas</w:t>
             </w:r>
           </w:p>
         </w:tc>
@@ -2408,7 +2473,7 @@
               <w:rPr>
                 <w:sz w:val="18"/>
               </w:rPr>
-              <w:t>[...]</w:t>
+              <w:t>Sukurta duomenų bazė su finansinių operacijų ir kategorijų lentelėmis.</w:t>
             </w:r>
           </w:p>
         </w:tc>
@@ -2432,7 +2497,7 @@
               <w:rPr>
                 <w:sz w:val="18"/>
               </w:rPr>
-              <w:t>[...]</w:t>
+              <w:t>1</w:t>
             </w:r>
           </w:p>
         </w:tc>
@@ -2461,8 +2526,7 @@
               <w:rPr>
                 <w:sz w:val="18"/>
               </w:rPr>
-              <w:lastRenderedPageBreak/>
-              <w:t>[...]</w:t>
+              <w:t>Naudotojo sąsajos kūrimas</w:t>
             </w:r>
           </w:p>
         </w:tc>
@@ -2486,7 +2550,7 @@
               <w:rPr>
                 <w:sz w:val="18"/>
               </w:rPr>
-              <w:t>[...]</w:t>
+              <w:t>Sukurti pagrindiniai sistemos puslapiai ir formos pajamoms bei išlaidoms įvesti.</w:t>
             </w:r>
           </w:p>
         </w:tc>
@@ -2510,7 +2574,7 @@
               <w:rPr>
                 <w:sz w:val="18"/>
               </w:rPr>
-              <w:t>[...]</w:t>
+              <w:t>2</w:t>
             </w:r>
           </w:p>
         </w:tc>
@@ -2539,7 +2603,7 @@
               <w:rPr>
                 <w:sz w:val="18"/>
               </w:rPr>
-              <w:t>[...]</w:t>
+              <w:t>Finansinių operacijų valdymas</w:t>
             </w:r>
           </w:p>
         </w:tc>
@@ -2563,7 +2627,7 @@
               <w:rPr>
                 <w:sz w:val="18"/>
               </w:rPr>
-              <w:t>[...]</w:t>
+              <w:t>Galimybė peržiūrėti, redaguoti ir ištrinti įvestas operacijas.</w:t>
             </w:r>
           </w:p>
         </w:tc>
@@ -2587,7 +2651,7 @@
               <w:rPr>
                 <w:sz w:val="18"/>
               </w:rPr>
-              <w:t>[...]</w:t>
+              <w:t>3</w:t>
             </w:r>
           </w:p>
         </w:tc>
@@ -2599,6 +2663,9 @@
       </w:pPr>
     </w:p>
     <w:p>
+      <w:pPr>
+        <w:jc w:val="both"/>
+      </w:pPr>
       <w:r>
         <w:rPr>
           <w:b/>
@@ -2606,7 +2673,13 @@
         <w:t>Būsimo prototipo veikimo scenarijus:</w:t>
       </w:r>
       <w:r>
-        <w:t xml:space="preserve"> [Kokį pagrindinės funkcijos veiksmą norėsite parodyti? Kokius duomenis pateiksite ir kokio rezultato tikėsitės?]</w:t>
+        <w:t xml:space="preserve"> </w:t>
+      </w:r>
+      <w:r>
+        <w:t>N</w:t>
+      </w:r>
+      <w:r>
+        <w:t>audotojas į sistemą įves kelias finansines operacijas: pavyzdžiui, 1500 € atlyginimą, 500 € maisto išlaidų, 150 € transporto išlaidų ir 100 € pramogų išlaidų. Tada naudotojas pasirinkęs spalio mėnesį atidarys finansinę suvestinę. Sistema turės parodyti 1800 € bendrų pajamų, 750 € bendrų išlaidų ir 1050 € likutį.</w:t>
       </w:r>
     </w:p>
     <w:tbl>
@@ -2703,13 +2776,77 @@
           </w:tcPr>
           <w:p>
             <w:pPr>
+              <w:spacing w:after="0" w:line="240" w:lineRule="auto"/>
+              <w:rPr>
+                <w:rFonts w:ascii="Times New Roman" w:hAnsi="Times New Roman"/>
+                <w:color w:val="auto"/>
+                <w:sz w:val="24"/>
+              </w:rPr>
+            </w:pPr>
+            <w:r>
+              <w:t>Gali atsirasti klaidų skaičiuojant bendras pajamas, išlaidas ir balansą.</w:t>
+            </w:r>
+          </w:p>
+          <w:p>
+            <w:pPr>
               <w:spacing w:after="0" w:line="240" w:lineRule="exact"/>
             </w:pPr>
+          </w:p>
+        </w:tc>
+        <w:tc>
+          <w:tcPr>
+            <w:tcW w:w="5090" w:type="dxa"/>
+            <w:shd w:val="clear" w:color="auto" w:fill="F1F5F7"/>
+            <w:tcMar>
+              <w:top w:w="80" w:type="dxa"/>
+              <w:left w:w="100" w:type="dxa"/>
+              <w:bottom w:w="80" w:type="dxa"/>
+              <w:right w:w="100" w:type="dxa"/>
+            </w:tcMar>
+            <w:vAlign w:val="center"/>
+          </w:tcPr>
+          <w:p>
+            <w:pPr>
+              <w:spacing w:after="0" w:line="240" w:lineRule="auto"/>
+              <w:rPr>
+                <w:rFonts w:ascii="Times New Roman" w:hAnsi="Times New Roman"/>
+                <w:color w:val="auto"/>
+                <w:sz w:val="24"/>
+              </w:rPr>
+            </w:pPr>
             <w:r>
+              <w:t>Patikrinsiu skaičiavimus su iš anksto paruoštais testiniais duomenimis ir palyginsiu gautus rezultatus su rankiniu būdu apskaičiuotomis reikšmėmis.</w:t>
+            </w:r>
+          </w:p>
+        </w:tc>
+      </w:tr>
+      <w:tr>
+        <w:trPr>
+          <w:cantSplit/>
+        </w:trPr>
+        <w:tc>
+          <w:tcPr>
+            <w:tcW w:w="5090" w:type="dxa"/>
+            <w:shd w:val="clear" w:color="auto" w:fill="F1F5F7"/>
+            <w:tcMar>
+              <w:top w:w="80" w:type="dxa"/>
+              <w:left w:w="100" w:type="dxa"/>
+              <w:bottom w:w="80" w:type="dxa"/>
+              <w:right w:w="100" w:type="dxa"/>
+            </w:tcMar>
+            <w:vAlign w:val="center"/>
+          </w:tcPr>
+          <w:p>
+            <w:pPr>
+              <w:spacing w:after="0" w:line="240" w:lineRule="auto"/>
               <w:rPr>
-                <w:sz w:val="18"/>
+                <w:rFonts w:ascii="Times New Roman" w:hAnsi="Times New Roman"/>
+                <w:color w:val="auto"/>
+                <w:sz w:val="24"/>
               </w:rPr>
-              <w:t>[...]</w:t>
+            </w:pPr>
+            <w:r>
+              <w:t>Naudotojas gali įvesti netinkamus duomenis, pavyzdžiui, nulinę ar neigiamą sumą arba neįvesti privalomų laukų.</w:t>
             </w:r>
           </w:p>
         </w:tc>
@@ -2727,13 +2864,15 @@
           </w:tcPr>
           <w:p>
             <w:pPr>
-              <w:spacing w:after="0" w:line="240" w:lineRule="exact"/>
+              <w:spacing w:after="0" w:line="240" w:lineRule="auto"/>
+              <w:rPr>
+                <w:rFonts w:ascii="Times New Roman" w:hAnsi="Times New Roman"/>
+                <w:color w:val="auto"/>
+                <w:sz w:val="24"/>
+              </w:rPr>
             </w:pPr>
             <w:r>
-              <w:rPr>
-                <w:sz w:val="18"/>
-              </w:rPr>
-              <w:t>[...]</w:t>
+              <w:t>Įgyvendinsiu duomenų validavimą ir patikrinsiu klaidingos įvesties scenarijus.</w:t>
             </w:r>
           </w:p>
         </w:tc>
@@ -2758,8 +2897,8 @@
       </w:r>
     </w:p>
     <w:sectPr>
-      <w:headerReference w:type="default" r:id="rId8"/>
-      <w:footerReference w:type="default" r:id="rId9"/>
+      <w:headerReference w:type="default" r:id="rId9"/>
+      <w:footerReference w:type="default" r:id="rId10"/>
       <w:pgSz w:w="11906" w:h="16838"/>
       <w:pgMar w:top="960" w:right="860" w:bottom="920" w:left="860" w:header="400" w:footer="400" w:gutter="0"/>
       <w:cols w:space="720"/>
@@ -2807,13 +2946,7 @@
       <w:rPr>
         <w:sz w:val="16"/>
       </w:rPr>
-      <w:t xml:space="preserve">Kursinio </w:t>
-    </w:r>
-    <w:r>
-      <w:rPr>
-        <w:sz w:val="16"/>
-      </w:rPr>
-      <w:t>darbo I dalis</w:t>
+      <w:t>Kursinio darbo I dalis</w:t>
     </w:r>
     <w:r>
       <w:rPr>

</xml_diff>